<commit_message>
Update README and report cross-references
Co-Authored-By: Claude Sonnet 5.5 <noreply@anthropic.com>
Claude-Session: https://claude.ai/code/session_01F7Q8yGqimoQNARdGvrQb8k
</commit_message>
<xml_diff>
--- a/docs/report/MMA3001_Written_Project_Documentation.docx
+++ b/docs/report/MMA3001_Written_Project_Documentation.docx
@@ -5064,23 +5064,7 @@
           <w:sz w:val="21"/>
           <w:szCs w:val="21"/>
         </w:rPr>
-        <w:t xml:space="preserve"> It sped up building the pipeline and exposed me to many methods at once. The depth-sampling bug showed that code can look right and still be wrong, so verification against known answers and ground truth was necessary rather than optional. I remain responsible for all code, results and claims. Full disclosure: </w:t>
-      </w:r>
-      <w:r>
-        <w:rPr>
-          <w:rFonts w:ascii="Consolas" w:cs="Consolas" w:eastAsia="Consolas" w:hAnsi="Consolas"/>
-          <w:sz w:val="19"/>
-          <w:szCs w:val="19"/>
-        </w:rPr>
-        <w:t xml:space="preserve">AI_USE.md</w:t>
-      </w:r>
-      <w:r>
-        <w:rPr>
-          <w:rFonts w:ascii="Calibri" w:cs="Calibri" w:eastAsia="Calibri" w:hAnsi="Calibri"/>
-          <w:sz w:val="21"/>
-          <w:szCs w:val="21"/>
-        </w:rPr>
-        <w:t xml:space="preserve"> in the repository.</w:t>
+        <w:t xml:space="preserve"> It sped up building the pipeline and exposed me to many methods at once. The depth-sampling bug showed that code can look right and still be wrong, so verification against known answers and ground truth was necessary rather than optional. I remain responsible for all code, results and claims.</w:t>
       </w:r>
     </w:p>
     <w:p>

</xml_diff>

<commit_message>
Report: remove stale file reference from appendix
Co-Authored-By: Claude Sonnet 5.5 <noreply@anthropic.com>
Claude-Session: https://claude.ai/code/session_01F7Q8yGqimoQNARdGvrQb8k
</commit_message>
<xml_diff>
--- a/docs/report/MMA3001_Written_Project_Documentation.docx
+++ b/docs/report/MMA3001_Written_Project_Documentation.docx
@@ -5433,22 +5433,6 @@
           <w:szCs w:val="21"/>
         </w:rPr>
         <w:t xml:space="preserve"> (API HTML, test report, results tables), </w:t>
-      </w:r>
-      <w:r>
-        <w:rPr>
-          <w:rFonts w:ascii="Consolas" w:cs="Consolas" w:eastAsia="Consolas" w:hAnsi="Consolas"/>
-          <w:sz w:val="19"/>
-          <w:szCs w:val="19"/>
-        </w:rPr>
-        <w:t xml:space="preserve">AI_USE.md</w:t>
-      </w:r>
-      <w:r>
-        <w:rPr>
-          <w:rFonts w:ascii="Calibri" w:cs="Calibri" w:eastAsia="Calibri" w:hAnsi="Calibri"/>
-          <w:sz w:val="21"/>
-          <w:szCs w:val="21"/>
-        </w:rPr>
-        <w:t xml:space="preserve">, </w:t>
       </w:r>
       <w:r>
         <w:rPr>

</xml_diff>